<commit_message>
TP6 Java et 2-3 truc
</commit_message>
<xml_diff>
--- a/S2/R2.13 - Communication technique/TP 14-03/R2.13 BUTINFO 1 TD - S24 Infographie.docx
+++ b/S2/R2.13 - Communication technique/TP 14-03/R2.13 BUTINFO 1 TD - S24 Infographie.docx
@@ -1,6 +1,6 @@
 
 <file path=word/document.xml><?xml version="1.0" encoding="utf-8"?>
-<w:document xmlns:wpc="http://schemas.microsoft.com/office/word/2010/wordprocessingCanvas" xmlns:cx="http://schemas.microsoft.com/office/drawing/2014/chartex" xmlns:cx1="http://schemas.microsoft.com/office/drawing/2015/9/8/chartex" xmlns:cx2="http://schemas.microsoft.com/office/drawing/2015/10/21/chartex" xmlns:cx3="http://schemas.microsoft.com/office/drawing/2016/5/9/chartex" xmlns:cx4="http://schemas.microsoft.com/office/drawing/2016/5/10/chartex" xmlns:cx5="http://schemas.microsoft.com/office/drawing/2016/5/11/chartex" xmlns:cx6="http://schemas.microsoft.com/office/drawing/2016/5/12/chartex" xmlns:cx7="http://schemas.microsoft.com/office/drawing/2016/5/13/chartex" xmlns:cx8="http://schemas.microsoft.com/office/drawing/2016/5/14/chartex" xmlns:mc="http://schemas.openxmlformats.org/markup-compatibility/2006" xmlns:aink="http://schemas.microsoft.com/office/drawing/2016/ink" xmlns:am3d="http://schemas.microsoft.com/office/drawing/2017/model3d" xmlns:o="urn:schemas-microsoft-com:office:office" xmlns:r="http://schemas.openxmlformats.org/officeDocument/2006/relationships" xmlns:m="http://schemas.openxmlformats.org/officeDocument/2006/math" xmlns:v="urn:schemas-microsoft-com:vml" xmlns:wp14="http://schemas.microsoft.com/office/word/2010/wordprocessingDrawing" xmlns:wp="http://schemas.openxmlformats.org/drawingml/2006/wordprocessingDrawing" xmlns:w10="urn:schemas-microsoft-com:office:word" xmlns:w="http://schemas.openxmlformats.org/wordprocessingml/2006/main" xmlns:w14="http://schemas.microsoft.com/office/word/2010/wordml" xmlns:w15="http://schemas.microsoft.com/office/word/2012/wordml" xmlns:w16cex="http://schemas.microsoft.com/office/word/2018/wordml/cex" xmlns:w16cid="http://schemas.microsoft.com/office/word/2016/wordml/cid" xmlns:w16="http://schemas.microsoft.com/office/word/2018/wordml" xmlns:w16sdtdh="http://schemas.microsoft.com/office/word/2020/wordml/sdtdatahash" xmlns:w16se="http://schemas.microsoft.com/office/word/2015/wordml/symex" xmlns:wpg="http://schemas.microsoft.com/office/word/2010/wordprocessingGroup" xmlns:wpi="http://schemas.microsoft.com/office/word/2010/wordprocessingInk" xmlns:wne="http://schemas.microsoft.com/office/word/2006/wordml" xmlns:wps="http://schemas.microsoft.com/office/word/2010/wordprocessingShape" mc:Ignorable="w14 w15 w16se w16cid w16 w16cex w16sdtdh wp14">
+<w:document xmlns:wpc="http://schemas.microsoft.com/office/word/2010/wordprocessingCanvas" xmlns:cx="http://schemas.microsoft.com/office/drawing/2014/chartex" xmlns:cx1="http://schemas.microsoft.com/office/drawing/2015/9/8/chartex" xmlns:cx2="http://schemas.microsoft.com/office/drawing/2015/10/21/chartex" xmlns:cx3="http://schemas.microsoft.com/office/drawing/2016/5/9/chartex" xmlns:cx4="http://schemas.microsoft.com/office/drawing/2016/5/10/chartex" xmlns:cx5="http://schemas.microsoft.com/office/drawing/2016/5/11/chartex" xmlns:cx6="http://schemas.microsoft.com/office/drawing/2016/5/12/chartex" xmlns:cx7="http://schemas.microsoft.com/office/drawing/2016/5/13/chartex" xmlns:cx8="http://schemas.microsoft.com/office/drawing/2016/5/14/chartex" xmlns:mc="http://schemas.openxmlformats.org/markup-compatibility/2006" xmlns:aink="http://schemas.microsoft.com/office/drawing/2016/ink" xmlns:am3d="http://schemas.microsoft.com/office/drawing/2017/model3d" xmlns:o="urn:schemas-microsoft-com:office:office" xmlns:oel="http://schemas.microsoft.com/office/2019/extlst" xmlns:r="http://schemas.openxmlformats.org/officeDocument/2006/relationships" xmlns:m="http://schemas.openxmlformats.org/officeDocument/2006/math" xmlns:v="urn:schemas-microsoft-com:vml" xmlns:wp14="http://schemas.microsoft.com/office/word/2010/wordprocessingDrawing" xmlns:wp="http://schemas.openxmlformats.org/drawingml/2006/wordprocessingDrawing" xmlns:w10="urn:schemas-microsoft-com:office:word" xmlns:w="http://schemas.openxmlformats.org/wordprocessingml/2006/main" xmlns:w14="http://schemas.microsoft.com/office/word/2010/wordml" xmlns:w15="http://schemas.microsoft.com/office/word/2012/wordml" xmlns:w16cex="http://schemas.microsoft.com/office/word/2018/wordml/cex" xmlns:w16cid="http://schemas.microsoft.com/office/word/2016/wordml/cid" xmlns:w16="http://schemas.microsoft.com/office/word/2018/wordml" xmlns:w16du="http://schemas.microsoft.com/office/word/2023/wordml/word16du" xmlns:w16sdtdh="http://schemas.microsoft.com/office/word/2020/wordml/sdtdatahash" xmlns:w16sdtfl="http://schemas.microsoft.com/office/word/2024/wordml/sdtformatlock" xmlns:w16se="http://schemas.microsoft.com/office/word/2015/wordml/symex" xmlns:wpg="http://schemas.microsoft.com/office/word/2010/wordprocessingGroup" xmlns:wpi="http://schemas.microsoft.com/office/word/2010/wordprocessingInk" xmlns:wne="http://schemas.microsoft.com/office/word/2006/wordml" xmlns:wps="http://schemas.microsoft.com/office/word/2010/wordprocessingShape" mc:Ignorable="w14 w15 w16se w16cid w16 w16cex w16sdtdh w16sdtfl w16du wp14">
   <w:body>
     <w:p>
       <w:pPr>
@@ -197,7 +197,7 @@
                 <v:stroke joinstyle="miter"/>
                 <v:path gradientshapeok="t" o:connecttype="rect"/>
               </v:shapetype>
-              <v:shape id="Textbox 7" o:spid="_x0000_s1026" type="#_x0000_t202" style="position:absolute;margin-left:26.45pt;margin-top:15.05pt;width:542.4pt;height:21.3pt;z-index:-251651072;visibility:visible;mso-wrap-style:square;mso-wrap-distance-left:0;mso-wrap-distance-top:0;mso-wrap-distance-right:0;mso-wrap-distance-bottom:0;mso-position-horizontal:absolute;mso-position-horizontal-relative:page;mso-position-vertical:absolute;mso-position-vertical-relative:text;v-text-anchor:top" o:gfxdata="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" fillcolor="black" stroked="f">
+              <v:shape id="Textbox 7" o:spid="_x0000_s1026" type="#_x0000_t202" style="position:absolute;margin-left:26.45pt;margin-top:15.05pt;width:542.4pt;height:21.3pt;z-index:-251651072;visibility:visible;mso-wrap-style:square;mso-wrap-distance-left:0;mso-wrap-distance-top:0;mso-wrap-distance-right:0;mso-wrap-distance-bottom:0;mso-position-horizontal:absolute;mso-position-horizontal-relative:page;mso-position-vertical:absolute;mso-position-vertical-relative:text;v-text-anchor:top" o:gfxdata="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" fillcolor="black" stroked="f">
                 <v:textbox inset="0,0,0,0">
                   <w:txbxContent>
                     <w:p>
@@ -324,7 +324,73 @@
           <w:w w:val="90"/>
           <w:sz w:val="24"/>
         </w:rPr>
-        <w:t>(à formuler)</w:t>
+        <w:t xml:space="preserve">Une </w:t>
+      </w:r>
+      <w:r>
+        <w:rPr>
+          <w:rFonts w:ascii="Verdana" w:hAnsi="Verdana"/>
+          <w:b/>
+          <w:bCs/>
+          <w:color w:val="000000"/>
+          <w:spacing w:val="-10"/>
+          <w:w w:val="90"/>
+          <w:sz w:val="24"/>
+        </w:rPr>
+        <w:t>infographie</w:t>
+      </w:r>
+      <w:r>
+        <w:rPr>
+          <w:rFonts w:ascii="Verdana" w:hAnsi="Verdana"/>
+          <w:color w:val="000000"/>
+          <w:spacing w:val="-10"/>
+          <w:w w:val="90"/>
+          <w:sz w:val="24"/>
+        </w:rPr>
+        <w:t xml:space="preserve"> est une représentation visuelle d’informations ou de données. Son but est de </w:t>
+      </w:r>
+      <w:r>
+        <w:rPr>
+          <w:rFonts w:ascii="Verdana" w:hAnsi="Verdana"/>
+          <w:b/>
+          <w:bCs/>
+          <w:color w:val="000000"/>
+          <w:spacing w:val="-10"/>
+          <w:w w:val="90"/>
+          <w:sz w:val="24"/>
+        </w:rPr>
+        <w:t>synthétiser un message</w:t>
+      </w:r>
+      <w:r>
+        <w:rPr>
+          <w:rFonts w:ascii="Verdana" w:hAnsi="Verdana"/>
+          <w:color w:val="000000"/>
+          <w:spacing w:val="-10"/>
+          <w:w w:val="90"/>
+          <w:sz w:val="24"/>
+        </w:rPr>
+        <w:t xml:space="preserve"> de manière claire et attractive grâce à des </w:t>
+      </w:r>
+      <w:r>
+        <w:rPr>
+          <w:rFonts w:ascii="Verdana" w:hAnsi="Verdana"/>
+          <w:b/>
+          <w:bCs/>
+          <w:color w:val="000000"/>
+          <w:spacing w:val="-10"/>
+          <w:w w:val="90"/>
+          <w:sz w:val="24"/>
+        </w:rPr>
+        <w:t>images, icônes, graphiques et textes courts</w:t>
+      </w:r>
+      <w:r>
+        <w:rPr>
+          <w:rFonts w:ascii="Verdana" w:hAnsi="Verdana"/>
+          <w:color w:val="000000"/>
+          <w:spacing w:val="-10"/>
+          <w:w w:val="90"/>
+          <w:sz w:val="24"/>
+        </w:rPr>
+        <w:t>.</w:t>
       </w:r>
     </w:p>
     <w:p>
@@ -1108,7 +1174,7 @@
           </mc:Choice>
           <mc:Fallback>
             <w:pict>
-              <v:shape w14:anchorId="4CB0D92B" id="Textbox 12" o:spid="_x0000_s1027" type="#_x0000_t202" style="width:542.4pt;height:21.4pt;visibility:visible;mso-wrap-style:square;mso-left-percent:-10001;mso-top-percent:-10001;mso-position-horizontal:absolute;mso-position-horizontal-relative:char;mso-position-vertical:absolute;mso-position-vertical-relative:line;mso-left-percent:-10001;mso-top-percent:-10001;v-text-anchor:top" o:gfxdata="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" fillcolor="black" stroked="f">
+              <v:shape w14:anchorId="4CB0D92B" id="Textbox 12" o:spid="_x0000_s1027" type="#_x0000_t202" style="width:542.4pt;height:21.4pt;visibility:visible;mso-wrap-style:square;mso-left-percent:-10001;mso-top-percent:-10001;mso-position-horizontal:absolute;mso-position-horizontal-relative:char;mso-position-vertical:absolute;mso-position-vertical-relative:line;mso-left-percent:-10001;mso-top-percent:-10001;v-text-anchor:top" o:gfxdata="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" fillcolor="black" stroked="f">
                 <v:textbox inset="0,0,0,0">
                   <w:txbxContent>
                     <w:p>
@@ -2061,19 +2127,6 @@
           <w:sz w:val="24"/>
         </w:rPr>
       </w:pPr>
-    </w:p>
-    <w:p>
-      <w:pPr>
-        <w:pStyle w:val="Paragraphedeliste"/>
-        <w:tabs>
-          <w:tab w:val="left" w:pos="5238"/>
-        </w:tabs>
-        <w:ind w:left="5238" w:firstLine="0"/>
-        <w:rPr>
-          <w:rFonts w:ascii="Verdana" w:hAnsi="Verdana"/>
-          <w:sz w:val="24"/>
-        </w:rPr>
-      </w:pPr>
       <w:r>
         <w:rPr>
           <w:noProof/>
@@ -2082,13 +2135,13 @@
         <mc:AlternateContent>
           <mc:Choice Requires="wps">
             <w:drawing>
-              <wp:anchor distT="0" distB="0" distL="0" distR="0" simplePos="0" relativeHeight="251663360" behindDoc="1" locked="0" layoutInCell="1" allowOverlap="1" wp14:anchorId="7B0D4F26" wp14:editId="48A269E1">
+              <wp:anchor distT="0" distB="0" distL="0" distR="0" simplePos="0" relativeHeight="251663360" behindDoc="1" locked="0" layoutInCell="1" allowOverlap="1" wp14:anchorId="7B0D4F26" wp14:editId="536DF446">
                 <wp:simplePos x="0" y="0"/>
-                <wp:positionH relativeFrom="page">
-                  <wp:posOffset>2735580</wp:posOffset>
+                <wp:positionH relativeFrom="margin">
+                  <wp:align>left</wp:align>
                 </wp:positionH>
                 <wp:positionV relativeFrom="paragraph">
-                  <wp:posOffset>139700</wp:posOffset>
+                  <wp:posOffset>57150</wp:posOffset>
                 </wp:positionV>
                 <wp:extent cx="2179955" cy="6932295"/>
                 <wp:effectExtent l="5080" t="0" r="0" b="0"/>
@@ -2159,14 +2212,27 @@
           </mc:Choice>
           <mc:Fallback>
             <w:pict>
-              <v:shape w14:anchorId="46B0F24E" id="Graphic 23" o:spid="_x0000_s1026" style="position:absolute;margin-left:215.4pt;margin-top:11pt;width:171.65pt;height:545.85pt;rotation:90;z-index:-251653120;visibility:visible;mso-wrap-style:square;mso-width-percent:0;mso-height-percent:0;mso-wrap-distance-left:0;mso-wrap-distance-top:0;mso-wrap-distance-right:0;mso-wrap-distance-bottom:0;mso-position-horizontal:absolute;mso-position-horizontal-relative:page;mso-position-vertical:absolute;mso-position-vertical-relative:text;mso-width-percent:0;mso-height-percent:0;mso-width-relative:margin;mso-height-relative:margin;v-text-anchor:top" coordsize="2976245,5903595" o:gfxdata="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" path="m2976245,l,,,5903595r2976245,l2976245,xe" fillcolor="#ccc" stroked="f">
+              <v:shape w14:anchorId="319F52DE" id="Graphic 23" o:spid="_x0000_s1026" style="position:absolute;margin-left:0;margin-top:4.5pt;width:171.65pt;height:545.85pt;rotation:90;z-index:-251653120;visibility:visible;mso-wrap-style:square;mso-width-percent:0;mso-height-percent:0;mso-wrap-distance-left:0;mso-wrap-distance-top:0;mso-wrap-distance-right:0;mso-wrap-distance-bottom:0;mso-position-horizontal:left;mso-position-horizontal-relative:margin;mso-position-vertical:absolute;mso-position-vertical-relative:text;mso-width-percent:0;mso-height-percent:0;mso-width-relative:margin;mso-height-relative:margin;v-text-anchor:top" coordsize="2976245,5903595" o:gfxdata="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" path="m2976245,l,,,5903595r2976245,l2976245,xe" fillcolor="#ccc" stroked="f">
                 <v:path arrowok="t"/>
-                <w10:wrap type="topAndBottom" anchorx="page"/>
+                <w10:wrap type="topAndBottom" anchorx="margin"/>
               </v:shape>
             </w:pict>
           </mc:Fallback>
         </mc:AlternateContent>
       </w:r>
+    </w:p>
+    <w:p>
+      <w:pPr>
+        <w:pStyle w:val="Paragraphedeliste"/>
+        <w:tabs>
+          <w:tab w:val="left" w:pos="5238"/>
+        </w:tabs>
+        <w:ind w:left="5238" w:firstLine="0"/>
+        <w:rPr>
+          <w:rFonts w:ascii="Verdana" w:hAnsi="Verdana"/>
+          <w:sz w:val="24"/>
+        </w:rPr>
+      </w:pPr>
       <w:hyperlink r:id="rId22">
         <w:r>
           <w:rPr>
@@ -2280,7 +2346,7 @@
         <mc:AlternateContent>
           <mc:Choice Requires="wps">
             <w:drawing>
-              <wp:inline distT="0" distB="0" distL="0" distR="0" wp14:anchorId="19C4A6FF" wp14:editId="28473857">
+              <wp:inline distT="0" distB="0" distL="0" distR="0" wp14:anchorId="19C4A6FF" wp14:editId="0E2EBD35">
                 <wp:extent cx="6888480" cy="271780"/>
                 <wp:effectExtent l="0" t="0" r="0" b="0"/>
                 <wp:docPr id="20" name="Textbox 20"/>
@@ -2459,7 +2525,7 @@
           </mc:Choice>
           <mc:Fallback>
             <w:pict>
-              <v:shape w14:anchorId="19C4A6FF" id="Textbox 20" o:spid="_x0000_s1028" type="#_x0000_t202" style="width:542.4pt;height:21.4pt;visibility:visible;mso-wrap-style:square;mso-left-percent:-10001;mso-top-percent:-10001;mso-position-horizontal:absolute;mso-position-horizontal-relative:char;mso-position-vertical:absolute;mso-position-vertical-relative:line;mso-left-percent:-10001;mso-top-percent:-10001;v-text-anchor:top" o:gfxdata="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" fillcolor="black" stroked="f">
+              <v:shape w14:anchorId="19C4A6FF" id="Textbox 20" o:spid="_x0000_s1028" type="#_x0000_t202" style="width:542.4pt;height:21.4pt;visibility:visible;mso-wrap-style:square;mso-left-percent:-10001;mso-top-percent:-10001;mso-position-horizontal:absolute;mso-position-horizontal-relative:char;mso-position-vertical:absolute;mso-position-vertical-relative:line;mso-left-percent:-10001;mso-top-percent:-10001;v-text-anchor:top" o:gfxdata="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" fillcolor="black" stroked="f">
                 <v:textbox inset="0,0,0,0">
                   <w:txbxContent>
                     <w:p>
@@ -2730,7 +2796,6 @@
         </w:rPr>
         <w:t xml:space="preserve"> </w:t>
       </w:r>
-      <w:proofErr w:type="spellStart"/>
       <w:r>
         <w:rPr>
           <w:b/>
@@ -2741,7 +2806,6 @@
         </w:rPr>
         <w:t>Canva</w:t>
       </w:r>
-      <w:proofErr w:type="spellEnd"/>
     </w:p>
     <w:p>
       <w:pPr>
@@ -2972,7 +3036,7 @@
           </mc:Choice>
           <mc:Fallback>
             <w:pict>
-              <v:shape w14:anchorId="01C31BE8" id="Textbox 24" o:spid="_x0000_s1029" type="#_x0000_t202" style="width:542.4pt;height:21.4pt;visibility:visible;mso-wrap-style:square;mso-left-percent:-10001;mso-top-percent:-10001;mso-position-horizontal:absolute;mso-position-horizontal-relative:char;mso-position-vertical:absolute;mso-position-vertical-relative:line;mso-left-percent:-10001;mso-top-percent:-10001;v-text-anchor:top" o:gfxdata="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" fillcolor="black" stroked="f">
+              <v:shape w14:anchorId="01C31BE8" id="Textbox 24" o:spid="_x0000_s1029" type="#_x0000_t202" style="width:542.4pt;height:21.4pt;visibility:visible;mso-wrap-style:square;mso-left-percent:-10001;mso-top-percent:-10001;mso-position-horizontal:absolute;mso-position-horizontal-relative:char;mso-position-vertical:absolute;mso-position-vertical-relative:line;mso-left-percent:-10001;mso-top-percent:-10001;v-text-anchor:top" o:gfxdata="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" fillcolor="black" stroked="f">
                 <v:textbox inset="0,0,0,0">
                   <w:txbxContent>
                     <w:p>
@@ -3076,16 +3140,14 @@
         </w:rPr>
         <w:t xml:space="preserve"> </w:t>
       </w:r>
-      <w:proofErr w:type="gramStart"/>
       <w:r>
         <w:rPr>
           <w:rFonts w:ascii="Verdana" w:hAnsi="Verdana"/>
           <w:w w:val="90"/>
           <w:sz w:val="24"/>
         </w:rPr>
-        <w:t>travail</w:t>
-      </w:r>
-      <w:proofErr w:type="gramEnd"/>
+        <w:t>Travail</w:t>
+      </w:r>
       <w:r>
         <w:rPr>
           <w:rFonts w:ascii="Verdana" w:hAnsi="Verdana"/>
@@ -3454,16 +3516,16 @@
         <mc:AlternateContent>
           <mc:Choice Requires="wpg">
             <w:drawing>
-              <wp:anchor distT="0" distB="0" distL="0" distR="0" simplePos="0" relativeHeight="251672576" behindDoc="1" locked="0" layoutInCell="1" allowOverlap="1" wp14:anchorId="647256A8" wp14:editId="117352A9">
+              <wp:anchor distT="0" distB="0" distL="0" distR="0" simplePos="0" relativeHeight="251672576" behindDoc="1" locked="0" layoutInCell="1" allowOverlap="1" wp14:anchorId="647256A8" wp14:editId="2341C7B6">
                 <wp:simplePos x="0" y="0"/>
-                <wp:positionH relativeFrom="page">
-                  <wp:posOffset>0</wp:posOffset>
+                <wp:positionH relativeFrom="margin">
+                  <wp:align>left</wp:align>
                 </wp:positionH>
                 <wp:positionV relativeFrom="paragraph">
-                  <wp:posOffset>151765</wp:posOffset>
+                  <wp:posOffset>6985</wp:posOffset>
                 </wp:positionV>
                 <wp:extent cx="9801860" cy="5645150"/>
-                <wp:effectExtent l="0" t="0" r="0" b="0"/>
+                <wp:effectExtent l="0" t="0" r="27940" b="12700"/>
                 <wp:wrapTopAndBottom/>
                 <wp:docPr id="16" name="Group 16"/>
                 <wp:cNvGraphicFramePr>
@@ -3575,7 +3637,7 @@
           </mc:Choice>
           <mc:Fallback>
             <w:pict>
-              <v:group w14:anchorId="367A39F1" id="Group 16" o:spid="_x0000_s1026" style="position:absolute;margin-left:0;margin-top:11.95pt;width:771.8pt;height:444.5pt;z-index:-251643904;mso-wrap-distance-left:0;mso-wrap-distance-right:0;mso-position-horizontal-relative:page" coordsize="98018,56451" o:gfxdata="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">
+              <v:group w14:anchorId="46A2BA23" id="Group 16" o:spid="_x0000_s1026" style="position:absolute;margin-left:0;margin-top:.55pt;width:771.8pt;height:444.5pt;z-index:-251643904;mso-wrap-distance-left:0;mso-wrap-distance-right:0;mso-position-horizontal:left;mso-position-horizontal-relative:margin" coordsize="98018,56451" o:gfxdata="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">
                 <v:shapetype id="_x0000_t75" coordsize="21600,21600" o:spt="75" o:preferrelative="t" path="m@4@5l@4@11@9@11@9@5xe" filled="f" stroked="f">
                   <v:stroke joinstyle="miter"/>
                   <v:formulas>
@@ -3601,7 +3663,7 @@
                 <v:shape id="Graphic 18" o:spid="_x0000_s1028" style="position:absolute;width:98018;height:56451;visibility:visible;mso-wrap-style:square;v-text-anchor:top" coordsize="9801860,5645150" o:gfxdata="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" path="m,634r9801860,em9801225,r,5645150em9801860,5644515l,5644515em634,5645150l634,e" filled="f" strokeweight=".1pt">
                   <v:path arrowok="t"/>
                 </v:shape>
-                <w10:wrap type="topAndBottom" anchorx="page"/>
+                <w10:wrap type="topAndBottom" anchorx="margin"/>
               </v:group>
             </w:pict>
           </mc:Fallback>
@@ -3638,36 +3700,8 @@
           <w:spacing w:val="-10"/>
           <w:highlight w:val="darkGray"/>
         </w:rPr>
-        <w:t xml:space="preserve">Recherche </w:t>
-      </w:r>
-      <w:proofErr w:type="spellStart"/>
-      <w:proofErr w:type="gramStart"/>
-      <w:r>
-        <w:rPr>
-          <w:color w:val="FFFFFF"/>
-          <w:spacing w:val="-10"/>
-          <w:highlight w:val="darkGray"/>
-        </w:rPr>
-        <w:t>i,nternet</w:t>
-      </w:r>
-      <w:proofErr w:type="spellEnd"/>
-      <w:proofErr w:type="gramEnd"/>
-    </w:p>
-    <w:p>
-      <w:pPr>
-        <w:rPr>
-          <w:color w:val="FFFFFF"/>
-          <w:spacing w:val="-10"/>
-        </w:rPr>
-      </w:pPr>
-    </w:p>
-    <w:p>
-      <w:pPr>
-        <w:rPr>
-          <w:color w:val="000000" w:themeColor="text1"/>
-          <w:spacing w:val="-10"/>
-        </w:rPr>
-      </w:pPr>
+        <w:t>Recherche internet</w:t>
+      </w:r>
     </w:p>
     <w:p>
       <w:pPr>
@@ -3762,16 +3796,14 @@
         </w:rPr>
         <w:t>Constituer une « </w:t>
       </w:r>
-      <w:proofErr w:type="spellStart"/>
       <w:r>
         <w:rPr>
           <w:color w:val="000000" w:themeColor="text1"/>
           <w:spacing w:val="-10"/>
           <w:highlight w:val="lightGray"/>
         </w:rPr>
-        <w:t>malette</w:t>
-      </w:r>
-      <w:proofErr w:type="spellEnd"/>
+        <w:t>mallette</w:t>
+      </w:r>
       <w:r>
         <w:rPr>
           <w:color w:val="000000" w:themeColor="text1"/>
@@ -3787,15 +3819,13 @@
         </w:rPr>
         <w:t xml:space="preserve">, sites web, tutoriels (après avoir </w:t>
       </w:r>
-      <w:proofErr w:type="spellStart"/>
       <w:r>
         <w:rPr>
           <w:color w:val="000000" w:themeColor="text1"/>
           <w:spacing w:val="-10"/>
         </w:rPr>
-        <w:t>vérifier</w:t>
-      </w:r>
-      <w:proofErr w:type="spellEnd"/>
+        <w:t>vérifié</w:t>
+      </w:r>
       <w:r>
         <w:rPr>
           <w:color w:val="000000" w:themeColor="text1"/>
@@ -5564,7 +5594,7 @@
 </file>
 
 <file path=word/endnotes.xml><?xml version="1.0" encoding="utf-8"?>
-<w:endnotes xmlns:wpc="http://schemas.microsoft.com/office/word/2010/wordprocessingCanvas" xmlns:cx="http://schemas.microsoft.com/office/drawing/2014/chartex" xmlns:cx1="http://schemas.microsoft.com/office/drawing/2015/9/8/chartex" xmlns:cx2="http://schemas.microsoft.com/office/drawing/2015/10/21/chartex" xmlns:cx3="http://schemas.microsoft.com/office/drawing/2016/5/9/chartex" xmlns:cx4="http://schemas.microsoft.com/office/drawing/2016/5/10/chartex" xmlns:cx5="http://schemas.microsoft.com/office/drawing/2016/5/11/chartex" xmlns:cx6="http://schemas.microsoft.com/office/drawing/2016/5/12/chartex" xmlns:cx7="http://schemas.microsoft.com/office/drawing/2016/5/13/chartex" xmlns:cx8="http://schemas.microsoft.com/office/drawing/2016/5/14/chartex" xmlns:mc="http://schemas.openxmlformats.org/markup-compatibility/2006" xmlns:aink="http://schemas.microsoft.com/office/drawing/2016/ink" xmlns:am3d="http://schemas.microsoft.com/office/drawing/2017/model3d" xmlns:o="urn:schemas-microsoft-com:office:office" xmlns:r="http://schemas.openxmlformats.org/officeDocument/2006/relationships" xmlns:m="http://schemas.openxmlformats.org/officeDocument/2006/math" xmlns:v="urn:schemas-microsoft-com:vml" xmlns:wp14="http://schemas.microsoft.com/office/word/2010/wordprocessingDrawing" xmlns:wp="http://schemas.openxmlformats.org/drawingml/2006/wordprocessingDrawing" xmlns:w10="urn:schemas-microsoft-com:office:word" xmlns:w="http://schemas.openxmlformats.org/wordprocessingml/2006/main" xmlns:w14="http://schemas.microsoft.com/office/word/2010/wordml" xmlns:w15="http://schemas.microsoft.com/office/word/2012/wordml" xmlns:w16cex="http://schemas.microsoft.com/office/word/2018/wordml/cex" xmlns:w16cid="http://schemas.microsoft.com/office/word/2016/wordml/cid" xmlns:w16="http://schemas.microsoft.com/office/word/2018/wordml" xmlns:w16sdtdh="http://schemas.microsoft.com/office/word/2020/wordml/sdtdatahash" xmlns:w16se="http://schemas.microsoft.com/office/word/2015/wordml/symex" xmlns:wpg="http://schemas.microsoft.com/office/word/2010/wordprocessingGroup" xmlns:wpi="http://schemas.microsoft.com/office/word/2010/wordprocessingInk" xmlns:wne="http://schemas.microsoft.com/office/word/2006/wordml" xmlns:wps="http://schemas.microsoft.com/office/word/2010/wordprocessingShape" mc:Ignorable="w14 w15 w16se w16cid w16 w16cex w16sdtdh wp14">
+<w:endnotes xmlns:wpc="http://schemas.microsoft.com/office/word/2010/wordprocessingCanvas" xmlns:cx="http://schemas.microsoft.com/office/drawing/2014/chartex" xmlns:cx1="http://schemas.microsoft.com/office/drawing/2015/9/8/chartex" xmlns:cx2="http://schemas.microsoft.com/office/drawing/2015/10/21/chartex" xmlns:cx3="http://schemas.microsoft.com/office/drawing/2016/5/9/chartex" xmlns:cx4="http://schemas.microsoft.com/office/drawing/2016/5/10/chartex" xmlns:cx5="http://schemas.microsoft.com/office/drawing/2016/5/11/chartex" xmlns:cx6="http://schemas.microsoft.com/office/drawing/2016/5/12/chartex" xmlns:cx7="http://schemas.microsoft.com/office/drawing/2016/5/13/chartex" xmlns:cx8="http://schemas.microsoft.com/office/drawing/2016/5/14/chartex" xmlns:mc="http://schemas.openxmlformats.org/markup-compatibility/2006" xmlns:aink="http://schemas.microsoft.com/office/drawing/2016/ink" xmlns:am3d="http://schemas.microsoft.com/office/drawing/2017/model3d" xmlns:o="urn:schemas-microsoft-com:office:office" xmlns:oel="http://schemas.microsoft.com/office/2019/extlst" xmlns:r="http://schemas.openxmlformats.org/officeDocument/2006/relationships" xmlns:m="http://schemas.openxmlformats.org/officeDocument/2006/math" xmlns:v="urn:schemas-microsoft-com:vml" xmlns:wp14="http://schemas.microsoft.com/office/word/2010/wordprocessingDrawing" xmlns:wp="http://schemas.openxmlformats.org/drawingml/2006/wordprocessingDrawing" xmlns:w10="urn:schemas-microsoft-com:office:word" xmlns:w="http://schemas.openxmlformats.org/wordprocessingml/2006/main" xmlns:w14="http://schemas.microsoft.com/office/word/2010/wordml" xmlns:w15="http://schemas.microsoft.com/office/word/2012/wordml" xmlns:w16cex="http://schemas.microsoft.com/office/word/2018/wordml/cex" xmlns:w16cid="http://schemas.microsoft.com/office/word/2016/wordml/cid" xmlns:w16="http://schemas.microsoft.com/office/word/2018/wordml" xmlns:w16du="http://schemas.microsoft.com/office/word/2023/wordml/word16du" xmlns:w16sdtdh="http://schemas.microsoft.com/office/word/2020/wordml/sdtdatahash" xmlns:w16sdtfl="http://schemas.microsoft.com/office/word/2024/wordml/sdtformatlock" xmlns:w16se="http://schemas.microsoft.com/office/word/2015/wordml/symex" xmlns:wpg="http://schemas.microsoft.com/office/word/2010/wordprocessingGroup" xmlns:wpi="http://schemas.microsoft.com/office/word/2010/wordprocessingInk" xmlns:wne="http://schemas.microsoft.com/office/word/2006/wordml" xmlns:wps="http://schemas.microsoft.com/office/word/2010/wordprocessingShape" mc:Ignorable="w14 w15 w16se w16cid w16 w16cex w16sdtdh w16sdtfl w16du wp14">
   <w:endnote w:type="separator" w:id="-1">
     <w:p>
       <w:r>
@@ -5583,7 +5613,7 @@
 </file>
 
 <file path=word/footer1.xml><?xml version="1.0" encoding="utf-8"?>
-<w:ftr xmlns:wpc="http://schemas.microsoft.com/office/word/2010/wordprocessingCanvas" xmlns:cx="http://schemas.microsoft.com/office/drawing/2014/chartex" xmlns:cx1="http://schemas.microsoft.com/office/drawing/2015/9/8/chartex" xmlns:cx2="http://schemas.microsoft.com/office/drawing/2015/10/21/chartex" xmlns:cx3="http://schemas.microsoft.com/office/drawing/2016/5/9/chartex" xmlns:cx4="http://schemas.microsoft.com/office/drawing/2016/5/10/chartex" xmlns:cx5="http://schemas.microsoft.com/office/drawing/2016/5/11/chartex" xmlns:cx6="http://schemas.microsoft.com/office/drawing/2016/5/12/chartex" xmlns:cx7="http://schemas.microsoft.com/office/drawing/2016/5/13/chartex" xmlns:cx8="http://schemas.microsoft.com/office/drawing/2016/5/14/chartex" xmlns:mc="http://schemas.openxmlformats.org/markup-compatibility/2006" xmlns:aink="http://schemas.microsoft.com/office/drawing/2016/ink" xmlns:am3d="http://schemas.microsoft.com/office/drawing/2017/model3d" xmlns:o="urn:schemas-microsoft-com:office:office" xmlns:r="http://schemas.openxmlformats.org/officeDocument/2006/relationships" xmlns:m="http://schemas.openxmlformats.org/officeDocument/2006/math" xmlns:v="urn:schemas-microsoft-com:vml" xmlns:wp14="http://schemas.microsoft.com/office/word/2010/wordprocessingDrawing" xmlns:wp="http://schemas.openxmlformats.org/drawingml/2006/wordprocessingDrawing" xmlns:w10="urn:schemas-microsoft-com:office:word" xmlns:w="http://schemas.openxmlformats.org/wordprocessingml/2006/main" xmlns:w14="http://schemas.microsoft.com/office/word/2010/wordml" xmlns:w15="http://schemas.microsoft.com/office/word/2012/wordml" xmlns:w16cex="http://schemas.microsoft.com/office/word/2018/wordml/cex" xmlns:w16cid="http://schemas.microsoft.com/office/word/2016/wordml/cid" xmlns:w16="http://schemas.microsoft.com/office/word/2018/wordml" xmlns:w16sdtdh="http://schemas.microsoft.com/office/word/2020/wordml/sdtdatahash" xmlns:w16se="http://schemas.microsoft.com/office/word/2015/wordml/symex" xmlns:wpg="http://schemas.microsoft.com/office/word/2010/wordprocessingGroup" xmlns:wpi="http://schemas.microsoft.com/office/word/2010/wordprocessingInk" xmlns:wne="http://schemas.microsoft.com/office/word/2006/wordml" xmlns:wps="http://schemas.microsoft.com/office/word/2010/wordprocessingShape" mc:Ignorable="w14 w15 w16se w16cid w16 w16cex w16sdtdh wp14">
+<w:ftr xmlns:wpc="http://schemas.microsoft.com/office/word/2010/wordprocessingCanvas" xmlns:cx="http://schemas.microsoft.com/office/drawing/2014/chartex" xmlns:cx1="http://schemas.microsoft.com/office/drawing/2015/9/8/chartex" xmlns:cx2="http://schemas.microsoft.com/office/drawing/2015/10/21/chartex" xmlns:cx3="http://schemas.microsoft.com/office/drawing/2016/5/9/chartex" xmlns:cx4="http://schemas.microsoft.com/office/drawing/2016/5/10/chartex" xmlns:cx5="http://schemas.microsoft.com/office/drawing/2016/5/11/chartex" xmlns:cx6="http://schemas.microsoft.com/office/drawing/2016/5/12/chartex" xmlns:cx7="http://schemas.microsoft.com/office/drawing/2016/5/13/chartex" xmlns:cx8="http://schemas.microsoft.com/office/drawing/2016/5/14/chartex" xmlns:mc="http://schemas.openxmlformats.org/markup-compatibility/2006" xmlns:aink="http://schemas.microsoft.com/office/drawing/2016/ink" xmlns:am3d="http://schemas.microsoft.com/office/drawing/2017/model3d" xmlns:o="urn:schemas-microsoft-com:office:office" xmlns:oel="http://schemas.microsoft.com/office/2019/extlst" xmlns:r="http://schemas.openxmlformats.org/officeDocument/2006/relationships" xmlns:m="http://schemas.openxmlformats.org/officeDocument/2006/math" xmlns:v="urn:schemas-microsoft-com:vml" xmlns:wp14="http://schemas.microsoft.com/office/word/2010/wordprocessingDrawing" xmlns:wp="http://schemas.openxmlformats.org/drawingml/2006/wordprocessingDrawing" xmlns:w10="urn:schemas-microsoft-com:office:word" xmlns:w="http://schemas.openxmlformats.org/wordprocessingml/2006/main" xmlns:w14="http://schemas.microsoft.com/office/word/2010/wordml" xmlns:w15="http://schemas.microsoft.com/office/word/2012/wordml" xmlns:w16cex="http://schemas.microsoft.com/office/word/2018/wordml/cex" xmlns:w16cid="http://schemas.microsoft.com/office/word/2016/wordml/cid" xmlns:w16="http://schemas.microsoft.com/office/word/2018/wordml" xmlns:w16du="http://schemas.microsoft.com/office/word/2023/wordml/word16du" xmlns:w16sdtdh="http://schemas.microsoft.com/office/word/2020/wordml/sdtdatahash" xmlns:w16sdtfl="http://schemas.microsoft.com/office/word/2024/wordml/sdtformatlock" xmlns:w16se="http://schemas.microsoft.com/office/word/2015/wordml/symex" xmlns:wpg="http://schemas.microsoft.com/office/word/2010/wordprocessingGroup" xmlns:wpi="http://schemas.microsoft.com/office/word/2010/wordprocessingInk" xmlns:wne="http://schemas.microsoft.com/office/word/2006/wordml" xmlns:wps="http://schemas.microsoft.com/office/word/2010/wordprocessingShape" mc:Ignorable="w14 w15 w16se w16cid w16 w16cex w16sdtdh w16sdtfl w16du wp14">
   <w:p>
     <w:pPr>
       <w:pStyle w:val="Pieddepage"/>
@@ -5593,7 +5623,7 @@
 </file>
 
 <file path=word/footer2.xml><?xml version="1.0" encoding="utf-8"?>
-<w:ftr xmlns:wpc="http://schemas.microsoft.com/office/word/2010/wordprocessingCanvas" xmlns:cx="http://schemas.microsoft.com/office/drawing/2014/chartex" xmlns:cx1="http://schemas.microsoft.com/office/drawing/2015/9/8/chartex" xmlns:cx2="http://schemas.microsoft.com/office/drawing/2015/10/21/chartex" xmlns:cx3="http://schemas.microsoft.com/office/drawing/2016/5/9/chartex" xmlns:cx4="http://schemas.microsoft.com/office/drawing/2016/5/10/chartex" xmlns:cx5="http://schemas.microsoft.com/office/drawing/2016/5/11/chartex" xmlns:cx6="http://schemas.microsoft.com/office/drawing/2016/5/12/chartex" xmlns:cx7="http://schemas.microsoft.com/office/drawing/2016/5/13/chartex" xmlns:cx8="http://schemas.microsoft.com/office/drawing/2016/5/14/chartex" xmlns:mc="http://schemas.openxmlformats.org/markup-compatibility/2006" xmlns:aink="http://schemas.microsoft.com/office/drawing/2016/ink" xmlns:am3d="http://schemas.microsoft.com/office/drawing/2017/model3d" xmlns:o="urn:schemas-microsoft-com:office:office" xmlns:r="http://schemas.openxmlformats.org/officeDocument/2006/relationships" xmlns:m="http://schemas.openxmlformats.org/officeDocument/2006/math" xmlns:v="urn:schemas-microsoft-com:vml" xmlns:wp14="http://schemas.microsoft.com/office/word/2010/wordprocessingDrawing" xmlns:wp="http://schemas.openxmlformats.org/drawingml/2006/wordprocessingDrawing" xmlns:w10="urn:schemas-microsoft-com:office:word" xmlns:w="http://schemas.openxmlformats.org/wordprocessingml/2006/main" xmlns:w14="http://schemas.microsoft.com/office/word/2010/wordml" xmlns:w15="http://schemas.microsoft.com/office/word/2012/wordml" xmlns:w16cex="http://schemas.microsoft.com/office/word/2018/wordml/cex" xmlns:w16cid="http://schemas.microsoft.com/office/word/2016/wordml/cid" xmlns:w16="http://schemas.microsoft.com/office/word/2018/wordml" xmlns:w16sdtdh="http://schemas.microsoft.com/office/word/2020/wordml/sdtdatahash" xmlns:w16se="http://schemas.microsoft.com/office/word/2015/wordml/symex" xmlns:wpg="http://schemas.microsoft.com/office/word/2010/wordprocessingGroup" xmlns:wpi="http://schemas.microsoft.com/office/word/2010/wordprocessingInk" xmlns:wne="http://schemas.microsoft.com/office/word/2006/wordml" xmlns:wps="http://schemas.microsoft.com/office/word/2010/wordprocessingShape" mc:Ignorable="w14 w15 w16se w16cid w16 w16cex w16sdtdh wp14">
+<w:ftr xmlns:wpc="http://schemas.microsoft.com/office/word/2010/wordprocessingCanvas" xmlns:cx="http://schemas.microsoft.com/office/drawing/2014/chartex" xmlns:cx1="http://schemas.microsoft.com/office/drawing/2015/9/8/chartex" xmlns:cx2="http://schemas.microsoft.com/office/drawing/2015/10/21/chartex" xmlns:cx3="http://schemas.microsoft.com/office/drawing/2016/5/9/chartex" xmlns:cx4="http://schemas.microsoft.com/office/drawing/2016/5/10/chartex" xmlns:cx5="http://schemas.microsoft.com/office/drawing/2016/5/11/chartex" xmlns:cx6="http://schemas.microsoft.com/office/drawing/2016/5/12/chartex" xmlns:cx7="http://schemas.microsoft.com/office/drawing/2016/5/13/chartex" xmlns:cx8="http://schemas.microsoft.com/office/drawing/2016/5/14/chartex" xmlns:mc="http://schemas.openxmlformats.org/markup-compatibility/2006" xmlns:aink="http://schemas.microsoft.com/office/drawing/2016/ink" xmlns:am3d="http://schemas.microsoft.com/office/drawing/2017/model3d" xmlns:o="urn:schemas-microsoft-com:office:office" xmlns:oel="http://schemas.microsoft.com/office/2019/extlst" xmlns:r="http://schemas.openxmlformats.org/officeDocument/2006/relationships" xmlns:m="http://schemas.openxmlformats.org/officeDocument/2006/math" xmlns:v="urn:schemas-microsoft-com:vml" xmlns:wp14="http://schemas.microsoft.com/office/word/2010/wordprocessingDrawing" xmlns:wp="http://schemas.openxmlformats.org/drawingml/2006/wordprocessingDrawing" xmlns:w10="urn:schemas-microsoft-com:office:word" xmlns:w="http://schemas.openxmlformats.org/wordprocessingml/2006/main" xmlns:w14="http://schemas.microsoft.com/office/word/2010/wordml" xmlns:w15="http://schemas.microsoft.com/office/word/2012/wordml" xmlns:w16cex="http://schemas.microsoft.com/office/word/2018/wordml/cex" xmlns:w16cid="http://schemas.microsoft.com/office/word/2016/wordml/cid" xmlns:w16="http://schemas.microsoft.com/office/word/2018/wordml" xmlns:w16du="http://schemas.microsoft.com/office/word/2023/wordml/word16du" xmlns:w16sdtdh="http://schemas.microsoft.com/office/word/2020/wordml/sdtdatahash" xmlns:w16sdtfl="http://schemas.microsoft.com/office/word/2024/wordml/sdtformatlock" xmlns:w16se="http://schemas.microsoft.com/office/word/2015/wordml/symex" xmlns:wpg="http://schemas.microsoft.com/office/word/2010/wordprocessingGroup" xmlns:wpi="http://schemas.microsoft.com/office/word/2010/wordprocessingInk" xmlns:wne="http://schemas.microsoft.com/office/word/2006/wordml" xmlns:wps="http://schemas.microsoft.com/office/word/2010/wordprocessingShape" mc:Ignorable="w14 w15 w16se w16cid w16 w16cex w16sdtdh w16sdtfl w16du wp14">
   <w:p>
     <w:pPr>
       <w:pStyle w:val="Corpsdetexte"/>
@@ -5609,7 +5639,7 @@
 </file>
 
 <file path=word/footer3.xml><?xml version="1.0" encoding="utf-8"?>
-<w:ftr xmlns:wpc="http://schemas.microsoft.com/office/word/2010/wordprocessingCanvas" xmlns:cx="http://schemas.microsoft.com/office/drawing/2014/chartex" xmlns:cx1="http://schemas.microsoft.com/office/drawing/2015/9/8/chartex" xmlns:cx2="http://schemas.microsoft.com/office/drawing/2015/10/21/chartex" xmlns:cx3="http://schemas.microsoft.com/office/drawing/2016/5/9/chartex" xmlns:cx4="http://schemas.microsoft.com/office/drawing/2016/5/10/chartex" xmlns:cx5="http://schemas.microsoft.com/office/drawing/2016/5/11/chartex" xmlns:cx6="http://schemas.microsoft.com/office/drawing/2016/5/12/chartex" xmlns:cx7="http://schemas.microsoft.com/office/drawing/2016/5/13/chartex" xmlns:cx8="http://schemas.microsoft.com/office/drawing/2016/5/14/chartex" xmlns:mc="http://schemas.openxmlformats.org/markup-compatibility/2006" xmlns:aink="http://schemas.microsoft.com/office/drawing/2016/ink" xmlns:am3d="http://schemas.microsoft.com/office/drawing/2017/model3d" xmlns:o="urn:schemas-microsoft-com:office:office" xmlns:r="http://schemas.openxmlformats.org/officeDocument/2006/relationships" xmlns:m="http://schemas.openxmlformats.org/officeDocument/2006/math" xmlns:v="urn:schemas-microsoft-com:vml" xmlns:wp14="http://schemas.microsoft.com/office/word/2010/wordprocessingDrawing" xmlns:wp="http://schemas.openxmlformats.org/drawingml/2006/wordprocessingDrawing" xmlns:w10="urn:schemas-microsoft-com:office:word" xmlns:w="http://schemas.openxmlformats.org/wordprocessingml/2006/main" xmlns:w14="http://schemas.microsoft.com/office/word/2010/wordml" xmlns:w15="http://schemas.microsoft.com/office/word/2012/wordml" xmlns:w16cex="http://schemas.microsoft.com/office/word/2018/wordml/cex" xmlns:w16cid="http://schemas.microsoft.com/office/word/2016/wordml/cid" xmlns:w16="http://schemas.microsoft.com/office/word/2018/wordml" xmlns:w16sdtdh="http://schemas.microsoft.com/office/word/2020/wordml/sdtdatahash" xmlns:w16se="http://schemas.microsoft.com/office/word/2015/wordml/symex" xmlns:wpg="http://schemas.microsoft.com/office/word/2010/wordprocessingGroup" xmlns:wpi="http://schemas.microsoft.com/office/word/2010/wordprocessingInk" xmlns:wne="http://schemas.microsoft.com/office/word/2006/wordml" xmlns:wps="http://schemas.microsoft.com/office/word/2010/wordprocessingShape" mc:Ignorable="w14 w15 w16se w16cid w16 w16cex w16sdtdh wp14">
+<w:ftr xmlns:wpc="http://schemas.microsoft.com/office/word/2010/wordprocessingCanvas" xmlns:cx="http://schemas.microsoft.com/office/drawing/2014/chartex" xmlns:cx1="http://schemas.microsoft.com/office/drawing/2015/9/8/chartex" xmlns:cx2="http://schemas.microsoft.com/office/drawing/2015/10/21/chartex" xmlns:cx3="http://schemas.microsoft.com/office/drawing/2016/5/9/chartex" xmlns:cx4="http://schemas.microsoft.com/office/drawing/2016/5/10/chartex" xmlns:cx5="http://schemas.microsoft.com/office/drawing/2016/5/11/chartex" xmlns:cx6="http://schemas.microsoft.com/office/drawing/2016/5/12/chartex" xmlns:cx7="http://schemas.microsoft.com/office/drawing/2016/5/13/chartex" xmlns:cx8="http://schemas.microsoft.com/office/drawing/2016/5/14/chartex" xmlns:mc="http://schemas.openxmlformats.org/markup-compatibility/2006" xmlns:aink="http://schemas.microsoft.com/office/drawing/2016/ink" xmlns:am3d="http://schemas.microsoft.com/office/drawing/2017/model3d" xmlns:o="urn:schemas-microsoft-com:office:office" xmlns:oel="http://schemas.microsoft.com/office/2019/extlst" xmlns:r="http://schemas.openxmlformats.org/officeDocument/2006/relationships" xmlns:m="http://schemas.openxmlformats.org/officeDocument/2006/math" xmlns:v="urn:schemas-microsoft-com:vml" xmlns:wp14="http://schemas.microsoft.com/office/word/2010/wordprocessingDrawing" xmlns:wp="http://schemas.openxmlformats.org/drawingml/2006/wordprocessingDrawing" xmlns:w10="urn:schemas-microsoft-com:office:word" xmlns:w="http://schemas.openxmlformats.org/wordprocessingml/2006/main" xmlns:w14="http://schemas.microsoft.com/office/word/2010/wordml" xmlns:w15="http://schemas.microsoft.com/office/word/2012/wordml" xmlns:w16cex="http://schemas.microsoft.com/office/word/2018/wordml/cex" xmlns:w16cid="http://schemas.microsoft.com/office/word/2016/wordml/cid" xmlns:w16="http://schemas.microsoft.com/office/word/2018/wordml" xmlns:w16du="http://schemas.microsoft.com/office/word/2023/wordml/word16du" xmlns:w16sdtdh="http://schemas.microsoft.com/office/word/2020/wordml/sdtdatahash" xmlns:w16sdtfl="http://schemas.microsoft.com/office/word/2024/wordml/sdtformatlock" xmlns:w16se="http://schemas.microsoft.com/office/word/2015/wordml/symex" xmlns:wpg="http://schemas.microsoft.com/office/word/2010/wordprocessingGroup" xmlns:wpi="http://schemas.microsoft.com/office/word/2010/wordprocessingInk" xmlns:wne="http://schemas.microsoft.com/office/word/2006/wordml" xmlns:wps="http://schemas.microsoft.com/office/word/2010/wordprocessingShape" mc:Ignorable="w14 w15 w16se w16cid w16 w16cex w16sdtdh w16sdtfl w16du wp14">
   <w:p>
     <w:pPr>
       <w:pStyle w:val="Pieddepage"/>
@@ -5619,7 +5649,7 @@
 </file>
 
 <file path=word/footer4.xml><?xml version="1.0" encoding="utf-8"?>
-<w:ftr xmlns:wpc="http://schemas.microsoft.com/office/word/2010/wordprocessingCanvas" xmlns:cx="http://schemas.microsoft.com/office/drawing/2014/chartex" xmlns:cx1="http://schemas.microsoft.com/office/drawing/2015/9/8/chartex" xmlns:cx2="http://schemas.microsoft.com/office/drawing/2015/10/21/chartex" xmlns:cx3="http://schemas.microsoft.com/office/drawing/2016/5/9/chartex" xmlns:cx4="http://schemas.microsoft.com/office/drawing/2016/5/10/chartex" xmlns:cx5="http://schemas.microsoft.com/office/drawing/2016/5/11/chartex" xmlns:cx6="http://schemas.microsoft.com/office/drawing/2016/5/12/chartex" xmlns:cx7="http://schemas.microsoft.com/office/drawing/2016/5/13/chartex" xmlns:cx8="http://schemas.microsoft.com/office/drawing/2016/5/14/chartex" xmlns:mc="http://schemas.openxmlformats.org/markup-compatibility/2006" xmlns:aink="http://schemas.microsoft.com/office/drawing/2016/ink" xmlns:am3d="http://schemas.microsoft.com/office/drawing/2017/model3d" xmlns:o="urn:schemas-microsoft-com:office:office" xmlns:r="http://schemas.openxmlformats.org/officeDocument/2006/relationships" xmlns:m="http://schemas.openxmlformats.org/officeDocument/2006/math" xmlns:v="urn:schemas-microsoft-com:vml" xmlns:wp14="http://schemas.microsoft.com/office/word/2010/wordprocessingDrawing" xmlns:wp="http://schemas.openxmlformats.org/drawingml/2006/wordprocessingDrawing" xmlns:w10="urn:schemas-microsoft-com:office:word" xmlns:w="http://schemas.openxmlformats.org/wordprocessingml/2006/main" xmlns:w14="http://schemas.microsoft.com/office/word/2010/wordml" xmlns:w15="http://schemas.microsoft.com/office/word/2012/wordml" xmlns:w16cex="http://schemas.microsoft.com/office/word/2018/wordml/cex" xmlns:w16cid="http://schemas.microsoft.com/office/word/2016/wordml/cid" xmlns:w16="http://schemas.microsoft.com/office/word/2018/wordml" xmlns:w16sdtdh="http://schemas.microsoft.com/office/word/2020/wordml/sdtdatahash" xmlns:w16se="http://schemas.microsoft.com/office/word/2015/wordml/symex" xmlns:wpg="http://schemas.microsoft.com/office/word/2010/wordprocessingGroup" xmlns:wpi="http://schemas.microsoft.com/office/word/2010/wordprocessingInk" xmlns:wne="http://schemas.microsoft.com/office/word/2006/wordml" xmlns:wps="http://schemas.microsoft.com/office/word/2010/wordprocessingShape" mc:Ignorable="w14 w15 w16se w16cid w16 w16cex w16sdtdh wp14">
+<w:ftr xmlns:wpc="http://schemas.microsoft.com/office/word/2010/wordprocessingCanvas" xmlns:cx="http://schemas.microsoft.com/office/drawing/2014/chartex" xmlns:cx1="http://schemas.microsoft.com/office/drawing/2015/9/8/chartex" xmlns:cx2="http://schemas.microsoft.com/office/drawing/2015/10/21/chartex" xmlns:cx3="http://schemas.microsoft.com/office/drawing/2016/5/9/chartex" xmlns:cx4="http://schemas.microsoft.com/office/drawing/2016/5/10/chartex" xmlns:cx5="http://schemas.microsoft.com/office/drawing/2016/5/11/chartex" xmlns:cx6="http://schemas.microsoft.com/office/drawing/2016/5/12/chartex" xmlns:cx7="http://schemas.microsoft.com/office/drawing/2016/5/13/chartex" xmlns:cx8="http://schemas.microsoft.com/office/drawing/2016/5/14/chartex" xmlns:mc="http://schemas.openxmlformats.org/markup-compatibility/2006" xmlns:aink="http://schemas.microsoft.com/office/drawing/2016/ink" xmlns:am3d="http://schemas.microsoft.com/office/drawing/2017/model3d" xmlns:o="urn:schemas-microsoft-com:office:office" xmlns:oel="http://schemas.microsoft.com/office/2019/extlst" xmlns:r="http://schemas.openxmlformats.org/officeDocument/2006/relationships" xmlns:m="http://schemas.openxmlformats.org/officeDocument/2006/math" xmlns:v="urn:schemas-microsoft-com:vml" xmlns:wp14="http://schemas.microsoft.com/office/word/2010/wordprocessingDrawing" xmlns:wp="http://schemas.openxmlformats.org/drawingml/2006/wordprocessingDrawing" xmlns:w10="urn:schemas-microsoft-com:office:word" xmlns:w="http://schemas.openxmlformats.org/wordprocessingml/2006/main" xmlns:w14="http://schemas.microsoft.com/office/word/2010/wordml" xmlns:w15="http://schemas.microsoft.com/office/word/2012/wordml" xmlns:w16cex="http://schemas.microsoft.com/office/word/2018/wordml/cex" xmlns:w16cid="http://schemas.microsoft.com/office/word/2016/wordml/cid" xmlns:w16="http://schemas.microsoft.com/office/word/2018/wordml" xmlns:w16du="http://schemas.microsoft.com/office/word/2023/wordml/word16du" xmlns:w16sdtdh="http://schemas.microsoft.com/office/word/2020/wordml/sdtdatahash" xmlns:w16sdtfl="http://schemas.microsoft.com/office/word/2024/wordml/sdtformatlock" xmlns:w16se="http://schemas.microsoft.com/office/word/2015/wordml/symex" xmlns:wpg="http://schemas.microsoft.com/office/word/2010/wordprocessingGroup" xmlns:wpi="http://schemas.microsoft.com/office/word/2010/wordprocessingInk" xmlns:wne="http://schemas.microsoft.com/office/word/2006/wordml" xmlns:wps="http://schemas.microsoft.com/office/word/2010/wordprocessingShape" mc:Ignorable="w14 w15 w16se w16cid w16 w16cex w16sdtdh w16sdtfl w16du wp14">
   <w:sdt>
     <w:sdtPr>
       <w:rPr>
@@ -5778,7 +5808,7 @@
                   </v:handles>
                   <o:complex v:ext="view"/>
                 </v:shapetype>
-                <v:shape id="Rectangle : carré corné 3" o:spid="_x0000_s1030" type="#_x0000_t65" style="position:absolute;margin-left:0;margin-top:0;width:29pt;height:21.6pt;z-index:251659264;visibility:visible;mso-wrap-style:square;mso-width-percent:0;mso-height-percent:0;mso-top-percent:70;mso-wrap-distance-left:9pt;mso-wrap-distance-top:0;mso-wrap-distance-right:9pt;mso-wrap-distance-bottom:0;mso-position-horizontal:left;mso-position-horizontal-relative:right-margin-area;mso-position-vertical-relative:bottom-margin-area;mso-width-percent:0;mso-height-percent:0;mso-top-percent:70;mso-width-relative:page;mso-height-relative:page;v-text-anchor:top" o:gfxdata="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" o:allowincell="f" adj="14135" strokecolor="gray" strokeweight=".25pt">
+                <v:shape id="Rectangle : carré corné 3" o:spid="_x0000_s1030" type="#_x0000_t65" style="position:absolute;margin-left:0;margin-top:0;width:29pt;height:21.6pt;z-index:251659264;visibility:visible;mso-wrap-style:square;mso-width-percent:0;mso-height-percent:0;mso-top-percent:70;mso-wrap-distance-left:9pt;mso-wrap-distance-top:0;mso-wrap-distance-right:9pt;mso-wrap-distance-bottom:0;mso-position-horizontal:left;mso-position-horizontal-relative:right-margin-area;mso-position-vertical-relative:bottom-margin-area;mso-width-percent:0;mso-height-percent:0;mso-top-percent:70;mso-width-relative:page;mso-height-relative:page;v-text-anchor:top" o:gfxdata="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" o:allowincell="f" adj="14135" strokecolor="gray" strokeweight=".25pt">
                   <v:textbox>
                     <w:txbxContent>
                       <w:p>
@@ -5824,7 +5854,7 @@
 </file>
 
 <file path=word/footnotes.xml><?xml version="1.0" encoding="utf-8"?>
-<w:footnotes xmlns:wpc="http://schemas.microsoft.com/office/word/2010/wordprocessingCanvas" xmlns:cx="http://schemas.microsoft.com/office/drawing/2014/chartex" xmlns:cx1="http://schemas.microsoft.com/office/drawing/2015/9/8/chartex" xmlns:cx2="http://schemas.microsoft.com/office/drawing/2015/10/21/chartex" xmlns:cx3="http://schemas.microsoft.com/office/drawing/2016/5/9/chartex" xmlns:cx4="http://schemas.microsoft.com/office/drawing/2016/5/10/chartex" xmlns:cx5="http://schemas.microsoft.com/office/drawing/2016/5/11/chartex" xmlns:cx6="http://schemas.microsoft.com/office/drawing/2016/5/12/chartex" xmlns:cx7="http://schemas.microsoft.com/office/drawing/2016/5/13/chartex" xmlns:cx8="http://schemas.microsoft.com/office/drawing/2016/5/14/chartex" xmlns:mc="http://schemas.openxmlformats.org/markup-compatibility/2006" xmlns:aink="http://schemas.microsoft.com/office/drawing/2016/ink" xmlns:am3d="http://schemas.microsoft.com/office/drawing/2017/model3d" xmlns:o="urn:schemas-microsoft-com:office:office" xmlns:r="http://schemas.openxmlformats.org/officeDocument/2006/relationships" xmlns:m="http://schemas.openxmlformats.org/officeDocument/2006/math" xmlns:v="urn:schemas-microsoft-com:vml" xmlns:wp14="http://schemas.microsoft.com/office/word/2010/wordprocessingDrawing" xmlns:wp="http://schemas.openxmlformats.org/drawingml/2006/wordprocessingDrawing" xmlns:w10="urn:schemas-microsoft-com:office:word" xmlns:w="http://schemas.openxmlformats.org/wordprocessingml/2006/main" xmlns:w14="http://schemas.microsoft.com/office/word/2010/wordml" xmlns:w15="http://schemas.microsoft.com/office/word/2012/wordml" xmlns:w16cex="http://schemas.microsoft.com/office/word/2018/wordml/cex" xmlns:w16cid="http://schemas.microsoft.com/office/word/2016/wordml/cid" xmlns:w16="http://schemas.microsoft.com/office/word/2018/wordml" xmlns:w16sdtdh="http://schemas.microsoft.com/office/word/2020/wordml/sdtdatahash" xmlns:w16se="http://schemas.microsoft.com/office/word/2015/wordml/symex" xmlns:wpg="http://schemas.microsoft.com/office/word/2010/wordprocessingGroup" xmlns:wpi="http://schemas.microsoft.com/office/word/2010/wordprocessingInk" xmlns:wne="http://schemas.microsoft.com/office/word/2006/wordml" xmlns:wps="http://schemas.microsoft.com/office/word/2010/wordprocessingShape" mc:Ignorable="w14 w15 w16se w16cid w16 w16cex w16sdtdh wp14">
+<w:footnotes xmlns:wpc="http://schemas.microsoft.com/office/word/2010/wordprocessingCanvas" xmlns:cx="http://schemas.microsoft.com/office/drawing/2014/chartex" xmlns:cx1="http://schemas.microsoft.com/office/drawing/2015/9/8/chartex" xmlns:cx2="http://schemas.microsoft.com/office/drawing/2015/10/21/chartex" xmlns:cx3="http://schemas.microsoft.com/office/drawing/2016/5/9/chartex" xmlns:cx4="http://schemas.microsoft.com/office/drawing/2016/5/10/chartex" xmlns:cx5="http://schemas.microsoft.com/office/drawing/2016/5/11/chartex" xmlns:cx6="http://schemas.microsoft.com/office/drawing/2016/5/12/chartex" xmlns:cx7="http://schemas.microsoft.com/office/drawing/2016/5/13/chartex" xmlns:cx8="http://schemas.microsoft.com/office/drawing/2016/5/14/chartex" xmlns:mc="http://schemas.openxmlformats.org/markup-compatibility/2006" xmlns:aink="http://schemas.microsoft.com/office/drawing/2016/ink" xmlns:am3d="http://schemas.microsoft.com/office/drawing/2017/model3d" xmlns:o="urn:schemas-microsoft-com:office:office" xmlns:oel="http://schemas.microsoft.com/office/2019/extlst" xmlns:r="http://schemas.openxmlformats.org/officeDocument/2006/relationships" xmlns:m="http://schemas.openxmlformats.org/officeDocument/2006/math" xmlns:v="urn:schemas-microsoft-com:vml" xmlns:wp14="http://schemas.microsoft.com/office/word/2010/wordprocessingDrawing" xmlns:wp="http://schemas.openxmlformats.org/drawingml/2006/wordprocessingDrawing" xmlns:w10="urn:schemas-microsoft-com:office:word" xmlns:w="http://schemas.openxmlformats.org/wordprocessingml/2006/main" xmlns:w14="http://schemas.microsoft.com/office/word/2010/wordml" xmlns:w15="http://schemas.microsoft.com/office/word/2012/wordml" xmlns:w16cex="http://schemas.microsoft.com/office/word/2018/wordml/cex" xmlns:w16cid="http://schemas.microsoft.com/office/word/2016/wordml/cid" xmlns:w16="http://schemas.microsoft.com/office/word/2018/wordml" xmlns:w16du="http://schemas.microsoft.com/office/word/2023/wordml/word16du" xmlns:w16sdtdh="http://schemas.microsoft.com/office/word/2020/wordml/sdtdatahash" xmlns:w16sdtfl="http://schemas.microsoft.com/office/word/2024/wordml/sdtformatlock" xmlns:w16se="http://schemas.microsoft.com/office/word/2015/wordml/symex" xmlns:wpg="http://schemas.microsoft.com/office/word/2010/wordprocessingGroup" xmlns:wpi="http://schemas.microsoft.com/office/word/2010/wordprocessingInk" xmlns:wne="http://schemas.microsoft.com/office/word/2006/wordml" xmlns:wps="http://schemas.microsoft.com/office/word/2010/wordprocessingShape" mc:Ignorable="w14 w15 w16se w16cid w16 w16cex w16sdtdh w16sdtfl w16du wp14">
   <w:footnote w:type="separator" w:id="-1">
     <w:p>
       <w:r>
@@ -5843,7 +5873,7 @@
 </file>
 
 <file path=word/header1.xml><?xml version="1.0" encoding="utf-8"?>
-<w:hdr xmlns:wpc="http://schemas.microsoft.com/office/word/2010/wordprocessingCanvas" xmlns:cx="http://schemas.microsoft.com/office/drawing/2014/chartex" xmlns:cx1="http://schemas.microsoft.com/office/drawing/2015/9/8/chartex" xmlns:cx2="http://schemas.microsoft.com/office/drawing/2015/10/21/chartex" xmlns:cx3="http://schemas.microsoft.com/office/drawing/2016/5/9/chartex" xmlns:cx4="http://schemas.microsoft.com/office/drawing/2016/5/10/chartex" xmlns:cx5="http://schemas.microsoft.com/office/drawing/2016/5/11/chartex" xmlns:cx6="http://schemas.microsoft.com/office/drawing/2016/5/12/chartex" xmlns:cx7="http://schemas.microsoft.com/office/drawing/2016/5/13/chartex" xmlns:cx8="http://schemas.microsoft.com/office/drawing/2016/5/14/chartex" xmlns:mc="http://schemas.openxmlformats.org/markup-compatibility/2006" xmlns:aink="http://schemas.microsoft.com/office/drawing/2016/ink" xmlns:am3d="http://schemas.microsoft.com/office/drawing/2017/model3d" xmlns:o="urn:schemas-microsoft-com:office:office" xmlns:r="http://schemas.openxmlformats.org/officeDocument/2006/relationships" xmlns:m="http://schemas.openxmlformats.org/officeDocument/2006/math" xmlns:v="urn:schemas-microsoft-com:vml" xmlns:wp14="http://schemas.microsoft.com/office/word/2010/wordprocessingDrawing" xmlns:wp="http://schemas.openxmlformats.org/drawingml/2006/wordprocessingDrawing" xmlns:w10="urn:schemas-microsoft-com:office:word" xmlns:w="http://schemas.openxmlformats.org/wordprocessingml/2006/main" xmlns:w14="http://schemas.microsoft.com/office/word/2010/wordml" xmlns:w15="http://schemas.microsoft.com/office/word/2012/wordml" xmlns:w16cex="http://schemas.microsoft.com/office/word/2018/wordml/cex" xmlns:w16cid="http://schemas.microsoft.com/office/word/2016/wordml/cid" xmlns:w16="http://schemas.microsoft.com/office/word/2018/wordml" xmlns:w16sdtdh="http://schemas.microsoft.com/office/word/2020/wordml/sdtdatahash" xmlns:w16se="http://schemas.microsoft.com/office/word/2015/wordml/symex" xmlns:wpg="http://schemas.microsoft.com/office/word/2010/wordprocessingGroup" xmlns:wpi="http://schemas.microsoft.com/office/word/2010/wordprocessingInk" xmlns:wne="http://schemas.microsoft.com/office/word/2006/wordml" xmlns:wps="http://schemas.microsoft.com/office/word/2010/wordprocessingShape" mc:Ignorable="w14 w15 w16se w16cid w16 w16cex w16sdtdh wp14">
+<w:hdr xmlns:wpc="http://schemas.microsoft.com/office/word/2010/wordprocessingCanvas" xmlns:cx="http://schemas.microsoft.com/office/drawing/2014/chartex" xmlns:cx1="http://schemas.microsoft.com/office/drawing/2015/9/8/chartex" xmlns:cx2="http://schemas.microsoft.com/office/drawing/2015/10/21/chartex" xmlns:cx3="http://schemas.microsoft.com/office/drawing/2016/5/9/chartex" xmlns:cx4="http://schemas.microsoft.com/office/drawing/2016/5/10/chartex" xmlns:cx5="http://schemas.microsoft.com/office/drawing/2016/5/11/chartex" xmlns:cx6="http://schemas.microsoft.com/office/drawing/2016/5/12/chartex" xmlns:cx7="http://schemas.microsoft.com/office/drawing/2016/5/13/chartex" xmlns:cx8="http://schemas.microsoft.com/office/drawing/2016/5/14/chartex" xmlns:mc="http://schemas.openxmlformats.org/markup-compatibility/2006" xmlns:aink="http://schemas.microsoft.com/office/drawing/2016/ink" xmlns:am3d="http://schemas.microsoft.com/office/drawing/2017/model3d" xmlns:o="urn:schemas-microsoft-com:office:office" xmlns:oel="http://schemas.microsoft.com/office/2019/extlst" xmlns:r="http://schemas.openxmlformats.org/officeDocument/2006/relationships" xmlns:m="http://schemas.openxmlformats.org/officeDocument/2006/math" xmlns:v="urn:schemas-microsoft-com:vml" xmlns:wp14="http://schemas.microsoft.com/office/word/2010/wordprocessingDrawing" xmlns:wp="http://schemas.openxmlformats.org/drawingml/2006/wordprocessingDrawing" xmlns:w10="urn:schemas-microsoft-com:office:word" xmlns:w="http://schemas.openxmlformats.org/wordprocessingml/2006/main" xmlns:w14="http://schemas.microsoft.com/office/word/2010/wordml" xmlns:w15="http://schemas.microsoft.com/office/word/2012/wordml" xmlns:w16cex="http://schemas.microsoft.com/office/word/2018/wordml/cex" xmlns:w16cid="http://schemas.microsoft.com/office/word/2016/wordml/cid" xmlns:w16="http://schemas.microsoft.com/office/word/2018/wordml" xmlns:w16du="http://schemas.microsoft.com/office/word/2023/wordml/word16du" xmlns:w16sdtdh="http://schemas.microsoft.com/office/word/2020/wordml/sdtdatahash" xmlns:w16sdtfl="http://schemas.microsoft.com/office/word/2024/wordml/sdtformatlock" xmlns:w16se="http://schemas.microsoft.com/office/word/2015/wordml/symex" xmlns:wpg="http://schemas.microsoft.com/office/word/2010/wordprocessingGroup" xmlns:wpi="http://schemas.microsoft.com/office/word/2010/wordprocessingInk" xmlns:wne="http://schemas.microsoft.com/office/word/2006/wordml" xmlns:wps="http://schemas.microsoft.com/office/word/2010/wordprocessingShape" mc:Ignorable="w14 w15 w16se w16cid w16 w16cex w16sdtdh w16sdtfl w16du wp14">
   <w:p>
     <w:pPr>
       <w:pStyle w:val="En-tte"/>
@@ -5853,7 +5883,7 @@
 </file>
 
 <file path=word/header2.xml><?xml version="1.0" encoding="utf-8"?>
-<w:hdr xmlns:wpc="http://schemas.microsoft.com/office/word/2010/wordprocessingCanvas" xmlns:cx="http://schemas.microsoft.com/office/drawing/2014/chartex" xmlns:cx1="http://schemas.microsoft.com/office/drawing/2015/9/8/chartex" xmlns:cx2="http://schemas.microsoft.com/office/drawing/2015/10/21/chartex" xmlns:cx3="http://schemas.microsoft.com/office/drawing/2016/5/9/chartex" xmlns:cx4="http://schemas.microsoft.com/office/drawing/2016/5/10/chartex" xmlns:cx5="http://schemas.microsoft.com/office/drawing/2016/5/11/chartex" xmlns:cx6="http://schemas.microsoft.com/office/drawing/2016/5/12/chartex" xmlns:cx7="http://schemas.microsoft.com/office/drawing/2016/5/13/chartex" xmlns:cx8="http://schemas.microsoft.com/office/drawing/2016/5/14/chartex" xmlns:mc="http://schemas.openxmlformats.org/markup-compatibility/2006" xmlns:aink="http://schemas.microsoft.com/office/drawing/2016/ink" xmlns:am3d="http://schemas.microsoft.com/office/drawing/2017/model3d" xmlns:o="urn:schemas-microsoft-com:office:office" xmlns:r="http://schemas.openxmlformats.org/officeDocument/2006/relationships" xmlns:m="http://schemas.openxmlformats.org/officeDocument/2006/math" xmlns:v="urn:schemas-microsoft-com:vml" xmlns:wp14="http://schemas.microsoft.com/office/word/2010/wordprocessingDrawing" xmlns:wp="http://schemas.openxmlformats.org/drawingml/2006/wordprocessingDrawing" xmlns:w10="urn:schemas-microsoft-com:office:word" xmlns:w="http://schemas.openxmlformats.org/wordprocessingml/2006/main" xmlns:w14="http://schemas.microsoft.com/office/word/2010/wordml" xmlns:w15="http://schemas.microsoft.com/office/word/2012/wordml" xmlns:w16cex="http://schemas.microsoft.com/office/word/2018/wordml/cex" xmlns:w16cid="http://schemas.microsoft.com/office/word/2016/wordml/cid" xmlns:w16="http://schemas.microsoft.com/office/word/2018/wordml" xmlns:w16sdtdh="http://schemas.microsoft.com/office/word/2020/wordml/sdtdatahash" xmlns:w16se="http://schemas.microsoft.com/office/word/2015/wordml/symex" xmlns:wpg="http://schemas.microsoft.com/office/word/2010/wordprocessingGroup" xmlns:wpi="http://schemas.microsoft.com/office/word/2010/wordprocessingInk" xmlns:wne="http://schemas.microsoft.com/office/word/2006/wordml" xmlns:wps="http://schemas.microsoft.com/office/word/2010/wordprocessingShape" mc:Ignorable="w14 w15 w16se w16cid w16 w16cex w16sdtdh wp14">
+<w:hdr xmlns:wpc="http://schemas.microsoft.com/office/word/2010/wordprocessingCanvas" xmlns:cx="http://schemas.microsoft.com/office/drawing/2014/chartex" xmlns:cx1="http://schemas.microsoft.com/office/drawing/2015/9/8/chartex" xmlns:cx2="http://schemas.microsoft.com/office/drawing/2015/10/21/chartex" xmlns:cx3="http://schemas.microsoft.com/office/drawing/2016/5/9/chartex" xmlns:cx4="http://schemas.microsoft.com/office/drawing/2016/5/10/chartex" xmlns:cx5="http://schemas.microsoft.com/office/drawing/2016/5/11/chartex" xmlns:cx6="http://schemas.microsoft.com/office/drawing/2016/5/12/chartex" xmlns:cx7="http://schemas.microsoft.com/office/drawing/2016/5/13/chartex" xmlns:cx8="http://schemas.microsoft.com/office/drawing/2016/5/14/chartex" xmlns:mc="http://schemas.openxmlformats.org/markup-compatibility/2006" xmlns:aink="http://schemas.microsoft.com/office/drawing/2016/ink" xmlns:am3d="http://schemas.microsoft.com/office/drawing/2017/model3d" xmlns:o="urn:schemas-microsoft-com:office:office" xmlns:oel="http://schemas.microsoft.com/office/2019/extlst" xmlns:r="http://schemas.openxmlformats.org/officeDocument/2006/relationships" xmlns:m="http://schemas.openxmlformats.org/officeDocument/2006/math" xmlns:v="urn:schemas-microsoft-com:vml" xmlns:wp14="http://schemas.microsoft.com/office/word/2010/wordprocessingDrawing" xmlns:wp="http://schemas.openxmlformats.org/drawingml/2006/wordprocessingDrawing" xmlns:w10="urn:schemas-microsoft-com:office:word" xmlns:w="http://schemas.openxmlformats.org/wordprocessingml/2006/main" xmlns:w14="http://schemas.microsoft.com/office/word/2010/wordml" xmlns:w15="http://schemas.microsoft.com/office/word/2012/wordml" xmlns:w16cex="http://schemas.microsoft.com/office/word/2018/wordml/cex" xmlns:w16cid="http://schemas.microsoft.com/office/word/2016/wordml/cid" xmlns:w16="http://schemas.microsoft.com/office/word/2018/wordml" xmlns:w16du="http://schemas.microsoft.com/office/word/2023/wordml/word16du" xmlns:w16sdtdh="http://schemas.microsoft.com/office/word/2020/wordml/sdtdatahash" xmlns:w16sdtfl="http://schemas.microsoft.com/office/word/2024/wordml/sdtformatlock" xmlns:w16se="http://schemas.microsoft.com/office/word/2015/wordml/symex" xmlns:wpg="http://schemas.microsoft.com/office/word/2010/wordprocessingGroup" xmlns:wpi="http://schemas.microsoft.com/office/word/2010/wordprocessingInk" xmlns:wne="http://schemas.microsoft.com/office/word/2006/wordml" xmlns:wps="http://schemas.microsoft.com/office/word/2010/wordprocessingShape" mc:Ignorable="w14 w15 w16se w16cid w16 w16cex w16sdtdh w16sdtfl w16du wp14">
   <w:p>
     <w:pPr>
       <w:pStyle w:val="En-tte"/>
@@ -5863,7 +5893,7 @@
 </file>
 
 <file path=word/header3.xml><?xml version="1.0" encoding="utf-8"?>
-<w:hdr xmlns:wpc="http://schemas.microsoft.com/office/word/2010/wordprocessingCanvas" xmlns:cx="http://schemas.microsoft.com/office/drawing/2014/chartex" xmlns:cx1="http://schemas.microsoft.com/office/drawing/2015/9/8/chartex" xmlns:cx2="http://schemas.microsoft.com/office/drawing/2015/10/21/chartex" xmlns:cx3="http://schemas.microsoft.com/office/drawing/2016/5/9/chartex" xmlns:cx4="http://schemas.microsoft.com/office/drawing/2016/5/10/chartex" xmlns:cx5="http://schemas.microsoft.com/office/drawing/2016/5/11/chartex" xmlns:cx6="http://schemas.microsoft.com/office/drawing/2016/5/12/chartex" xmlns:cx7="http://schemas.microsoft.com/office/drawing/2016/5/13/chartex" xmlns:cx8="http://schemas.microsoft.com/office/drawing/2016/5/14/chartex" xmlns:mc="http://schemas.openxmlformats.org/markup-compatibility/2006" xmlns:aink="http://schemas.microsoft.com/office/drawing/2016/ink" xmlns:am3d="http://schemas.microsoft.com/office/drawing/2017/model3d" xmlns:o="urn:schemas-microsoft-com:office:office" xmlns:r="http://schemas.openxmlformats.org/officeDocument/2006/relationships" xmlns:m="http://schemas.openxmlformats.org/officeDocument/2006/math" xmlns:v="urn:schemas-microsoft-com:vml" xmlns:wp14="http://schemas.microsoft.com/office/word/2010/wordprocessingDrawing" xmlns:wp="http://schemas.openxmlformats.org/drawingml/2006/wordprocessingDrawing" xmlns:w10="urn:schemas-microsoft-com:office:word" xmlns:w="http://schemas.openxmlformats.org/wordprocessingml/2006/main" xmlns:w14="http://schemas.microsoft.com/office/word/2010/wordml" xmlns:w15="http://schemas.microsoft.com/office/word/2012/wordml" xmlns:w16cex="http://schemas.microsoft.com/office/word/2018/wordml/cex" xmlns:w16cid="http://schemas.microsoft.com/office/word/2016/wordml/cid" xmlns:w16="http://schemas.microsoft.com/office/word/2018/wordml" xmlns:w16sdtdh="http://schemas.microsoft.com/office/word/2020/wordml/sdtdatahash" xmlns:w16se="http://schemas.microsoft.com/office/word/2015/wordml/symex" xmlns:wpg="http://schemas.microsoft.com/office/word/2010/wordprocessingGroup" xmlns:wpi="http://schemas.microsoft.com/office/word/2010/wordprocessingInk" xmlns:wne="http://schemas.microsoft.com/office/word/2006/wordml" xmlns:wps="http://schemas.microsoft.com/office/word/2010/wordprocessingShape" mc:Ignorable="w14 w15 w16se w16cid w16 w16cex w16sdtdh wp14">
+<w:hdr xmlns:wpc="http://schemas.microsoft.com/office/word/2010/wordprocessingCanvas" xmlns:cx="http://schemas.microsoft.com/office/drawing/2014/chartex" xmlns:cx1="http://schemas.microsoft.com/office/drawing/2015/9/8/chartex" xmlns:cx2="http://schemas.microsoft.com/office/drawing/2015/10/21/chartex" xmlns:cx3="http://schemas.microsoft.com/office/drawing/2016/5/9/chartex" xmlns:cx4="http://schemas.microsoft.com/office/drawing/2016/5/10/chartex" xmlns:cx5="http://schemas.microsoft.com/office/drawing/2016/5/11/chartex" xmlns:cx6="http://schemas.microsoft.com/office/drawing/2016/5/12/chartex" xmlns:cx7="http://schemas.microsoft.com/office/drawing/2016/5/13/chartex" xmlns:cx8="http://schemas.microsoft.com/office/drawing/2016/5/14/chartex" xmlns:mc="http://schemas.openxmlformats.org/markup-compatibility/2006" xmlns:aink="http://schemas.microsoft.com/office/drawing/2016/ink" xmlns:am3d="http://schemas.microsoft.com/office/drawing/2017/model3d" xmlns:o="urn:schemas-microsoft-com:office:office" xmlns:oel="http://schemas.microsoft.com/office/2019/extlst" xmlns:r="http://schemas.openxmlformats.org/officeDocument/2006/relationships" xmlns:m="http://schemas.openxmlformats.org/officeDocument/2006/math" xmlns:v="urn:schemas-microsoft-com:vml" xmlns:wp14="http://schemas.microsoft.com/office/word/2010/wordprocessingDrawing" xmlns:wp="http://schemas.openxmlformats.org/drawingml/2006/wordprocessingDrawing" xmlns:w10="urn:schemas-microsoft-com:office:word" xmlns:w="http://schemas.openxmlformats.org/wordprocessingml/2006/main" xmlns:w14="http://schemas.microsoft.com/office/word/2010/wordml" xmlns:w15="http://schemas.microsoft.com/office/word/2012/wordml" xmlns:w16cex="http://schemas.microsoft.com/office/word/2018/wordml/cex" xmlns:w16cid="http://schemas.microsoft.com/office/word/2016/wordml/cid" xmlns:w16="http://schemas.microsoft.com/office/word/2018/wordml" xmlns:w16du="http://schemas.microsoft.com/office/word/2023/wordml/word16du" xmlns:w16sdtdh="http://schemas.microsoft.com/office/word/2020/wordml/sdtdatahash" xmlns:w16sdtfl="http://schemas.microsoft.com/office/word/2024/wordml/sdtformatlock" xmlns:w16se="http://schemas.microsoft.com/office/word/2015/wordml/symex" xmlns:wpg="http://schemas.microsoft.com/office/word/2010/wordprocessingGroup" xmlns:wpi="http://schemas.microsoft.com/office/word/2010/wordprocessingInk" xmlns:wne="http://schemas.microsoft.com/office/word/2006/wordml" xmlns:wps="http://schemas.microsoft.com/office/word/2010/wordprocessingShape" mc:Ignorable="w14 w15 w16se w16cid w16 w16cex w16sdtdh w16sdtfl w16du wp14">
   <w:p>
     <w:pPr>
       <w:pStyle w:val="En-tte"/>
@@ -5873,7 +5903,7 @@
 </file>
 
 <file path=word/numbering.xml><?xml version="1.0" encoding="utf-8"?>
-<w:numbering xmlns:wpc="http://schemas.microsoft.com/office/word/2010/wordprocessingCanvas" xmlns:cx="http://schemas.microsoft.com/office/drawing/2014/chartex" xmlns:cx1="http://schemas.microsoft.com/office/drawing/2015/9/8/chartex" xmlns:cx2="http://schemas.microsoft.com/office/drawing/2015/10/21/chartex" xmlns:cx3="http://schemas.microsoft.com/office/drawing/2016/5/9/chartex" xmlns:cx4="http://schemas.microsoft.com/office/drawing/2016/5/10/chartex" xmlns:cx5="http://schemas.microsoft.com/office/drawing/2016/5/11/chartex" xmlns:cx6="http://schemas.microsoft.com/office/drawing/2016/5/12/chartex" xmlns:cx7="http://schemas.microsoft.com/office/drawing/2016/5/13/chartex" xmlns:cx8="http://schemas.microsoft.com/office/drawing/2016/5/14/chartex" xmlns:mc="http://schemas.openxmlformats.org/markup-compatibility/2006" xmlns:aink="http://schemas.microsoft.com/office/drawing/2016/ink" xmlns:am3d="http://schemas.microsoft.com/office/drawing/2017/model3d" xmlns:o="urn:schemas-microsoft-com:office:office" xmlns:r="http://schemas.openxmlformats.org/officeDocument/2006/relationships" xmlns:m="http://schemas.openxmlformats.org/officeDocument/2006/math" xmlns:v="urn:schemas-microsoft-com:vml" xmlns:wp14="http://schemas.microsoft.com/office/word/2010/wordprocessingDrawing" xmlns:wp="http://schemas.openxmlformats.org/drawingml/2006/wordprocessingDrawing" xmlns:w10="urn:schemas-microsoft-com:office:word" xmlns:w="http://schemas.openxmlformats.org/wordprocessingml/2006/main" xmlns:w14="http://schemas.microsoft.com/office/word/2010/wordml" xmlns:w15="http://schemas.microsoft.com/office/word/2012/wordml" xmlns:w16cex="http://schemas.microsoft.com/office/word/2018/wordml/cex" xmlns:w16cid="http://schemas.microsoft.com/office/word/2016/wordml/cid" xmlns:w16="http://schemas.microsoft.com/office/word/2018/wordml" xmlns:w16sdtdh="http://schemas.microsoft.com/office/word/2020/wordml/sdtdatahash" xmlns:w16se="http://schemas.microsoft.com/office/word/2015/wordml/symex" xmlns:wpg="http://schemas.microsoft.com/office/word/2010/wordprocessingGroup" xmlns:wpi="http://schemas.microsoft.com/office/word/2010/wordprocessingInk" xmlns:wne="http://schemas.microsoft.com/office/word/2006/wordml" xmlns:wps="http://schemas.microsoft.com/office/word/2010/wordprocessingShape" mc:Ignorable="w14 w15 w16se w16cid w16 w16cex w16sdtdh wp14">
+<w:numbering xmlns:wpc="http://schemas.microsoft.com/office/word/2010/wordprocessingCanvas" xmlns:cx="http://schemas.microsoft.com/office/drawing/2014/chartex" xmlns:cx1="http://schemas.microsoft.com/office/drawing/2015/9/8/chartex" xmlns:cx2="http://schemas.microsoft.com/office/drawing/2015/10/21/chartex" xmlns:cx3="http://schemas.microsoft.com/office/drawing/2016/5/9/chartex" xmlns:cx4="http://schemas.microsoft.com/office/drawing/2016/5/10/chartex" xmlns:cx5="http://schemas.microsoft.com/office/drawing/2016/5/11/chartex" xmlns:cx6="http://schemas.microsoft.com/office/drawing/2016/5/12/chartex" xmlns:cx7="http://schemas.microsoft.com/office/drawing/2016/5/13/chartex" xmlns:cx8="http://schemas.microsoft.com/office/drawing/2016/5/14/chartex" xmlns:mc="http://schemas.openxmlformats.org/markup-compatibility/2006" xmlns:aink="http://schemas.microsoft.com/office/drawing/2016/ink" xmlns:am3d="http://schemas.microsoft.com/office/drawing/2017/model3d" xmlns:o="urn:schemas-microsoft-com:office:office" xmlns:oel="http://schemas.microsoft.com/office/2019/extlst" xmlns:r="http://schemas.openxmlformats.org/officeDocument/2006/relationships" xmlns:m="http://schemas.openxmlformats.org/officeDocument/2006/math" xmlns:v="urn:schemas-microsoft-com:vml" xmlns:wp14="http://schemas.microsoft.com/office/word/2010/wordprocessingDrawing" xmlns:wp="http://schemas.openxmlformats.org/drawingml/2006/wordprocessingDrawing" xmlns:w10="urn:schemas-microsoft-com:office:word" xmlns:w="http://schemas.openxmlformats.org/wordprocessingml/2006/main" xmlns:w14="http://schemas.microsoft.com/office/word/2010/wordml" xmlns:w15="http://schemas.microsoft.com/office/word/2012/wordml" xmlns:w16cex="http://schemas.microsoft.com/office/word/2018/wordml/cex" xmlns:w16cid="http://schemas.microsoft.com/office/word/2016/wordml/cid" xmlns:w16="http://schemas.microsoft.com/office/word/2018/wordml" xmlns:w16du="http://schemas.microsoft.com/office/word/2023/wordml/word16du" xmlns:w16sdtdh="http://schemas.microsoft.com/office/word/2020/wordml/sdtdatahash" xmlns:w16sdtfl="http://schemas.microsoft.com/office/word/2024/wordml/sdtformatlock" xmlns:w16se="http://schemas.microsoft.com/office/word/2015/wordml/symex" xmlns:wpg="http://schemas.microsoft.com/office/word/2010/wordprocessingGroup" xmlns:wpi="http://schemas.microsoft.com/office/word/2010/wordprocessingInk" xmlns:wne="http://schemas.microsoft.com/office/word/2006/wordml" xmlns:wps="http://schemas.microsoft.com/office/word/2010/wordprocessingShape" mc:Ignorable="w14 w15 w16se w16cid w16 w16cex w16sdtdh w16sdtfl w16du wp14">
   <w:abstractNum w:abstractNumId="0" w15:restartNumberingAfterBreak="0">
     <w:nsid w:val="0B7A0BD7"/>
     <w:multiLevelType w:val="hybridMultilevel"/>
@@ -6837,35 +6867,35 @@
       </w:pPr>
     </w:lvl>
   </w:abstractNum>
-  <w:num w:numId="1">
+  <w:num w:numId="1" w16cid:durableId="1116867735">
     <w:abstractNumId w:val="1"/>
   </w:num>
-  <w:num w:numId="2">
+  <w:num w:numId="2" w16cid:durableId="867254555">
     <w:abstractNumId w:val="6"/>
   </w:num>
-  <w:num w:numId="3">
+  <w:num w:numId="3" w16cid:durableId="598833759">
     <w:abstractNumId w:val="0"/>
   </w:num>
-  <w:num w:numId="4">
+  <w:num w:numId="4" w16cid:durableId="804926824">
     <w:abstractNumId w:val="3"/>
   </w:num>
-  <w:num w:numId="5">
+  <w:num w:numId="5" w16cid:durableId="1491217714">
     <w:abstractNumId w:val="4"/>
   </w:num>
-  <w:num w:numId="6">
+  <w:num w:numId="6" w16cid:durableId="524177206">
     <w:abstractNumId w:val="5"/>
   </w:num>
-  <w:num w:numId="7">
+  <w:num w:numId="7" w16cid:durableId="1162502447">
     <w:abstractNumId w:val="7"/>
   </w:num>
-  <w:num w:numId="8">
+  <w:num w:numId="8" w16cid:durableId="103036872">
     <w:abstractNumId w:val="2"/>
   </w:num>
 </w:numbering>
 </file>
 
 <file path=word/styles.xml><?xml version="1.0" encoding="utf-8"?>
-<w:styles xmlns:mc="http://schemas.openxmlformats.org/markup-compatibility/2006" xmlns:r="http://schemas.openxmlformats.org/officeDocument/2006/relationships" xmlns:w="http://schemas.openxmlformats.org/wordprocessingml/2006/main" xmlns:w14="http://schemas.microsoft.com/office/word/2010/wordml" xmlns:w15="http://schemas.microsoft.com/office/word/2012/wordml" xmlns:w16cex="http://schemas.microsoft.com/office/word/2018/wordml/cex" xmlns:w16cid="http://schemas.microsoft.com/office/word/2016/wordml/cid" xmlns:w16="http://schemas.microsoft.com/office/word/2018/wordml" xmlns:w16sdtdh="http://schemas.microsoft.com/office/word/2020/wordml/sdtdatahash" xmlns:w16se="http://schemas.microsoft.com/office/word/2015/wordml/symex" mc:Ignorable="w14 w15 w16se w16cid w16 w16cex w16sdtdh">
+<w:styles xmlns:mc="http://schemas.openxmlformats.org/markup-compatibility/2006" xmlns:r="http://schemas.openxmlformats.org/officeDocument/2006/relationships" xmlns:w="http://schemas.openxmlformats.org/wordprocessingml/2006/main" xmlns:w14="http://schemas.microsoft.com/office/word/2010/wordml" xmlns:w15="http://schemas.microsoft.com/office/word/2012/wordml" xmlns:w16cex="http://schemas.microsoft.com/office/word/2018/wordml/cex" xmlns:w16cid="http://schemas.microsoft.com/office/word/2016/wordml/cid" xmlns:w16="http://schemas.microsoft.com/office/word/2018/wordml" xmlns:w16du="http://schemas.microsoft.com/office/word/2023/wordml/word16du" xmlns:w16sdtdh="http://schemas.microsoft.com/office/word/2020/wordml/sdtdatahash" xmlns:w16sdtfl="http://schemas.microsoft.com/office/word/2024/wordml/sdtformatlock" xmlns:w16se="http://schemas.microsoft.com/office/word/2015/wordml/symex" mc:Ignorable="w14 w15 w16se w16cid w16 w16cex w16sdtdh w16sdtfl w16du">
   <w:docDefaults>
     <w:rPrDefault>
       <w:rPr>
@@ -7315,7 +7345,6 @@
   <w:style w:type="character" w:default="1" w:styleId="Policepardfaut">
     <w:name w:val="Default Paragraph Font"/>
     <w:uiPriority w:val="1"/>
-    <w:semiHidden/>
     <w:unhideWhenUsed/>
   </w:style>
   <w:style w:type="table" w:default="1" w:styleId="TableauNormal">

</xml_diff>